<commit_message>
Adding Day 6 Tasks
</commit_message>
<xml_diff>
--- a/DAY 7/Develop a Mini Project and Integrate GitHub with Jenkins.docx
+++ b/DAY 7/Develop a Mini Project and Integrate GitHub with Jenkins.docx
@@ -538,175 +538,6 @@
       </w:r>
     </w:p>
     <w:p/>
-    <w:p>
-      <w:r>
-        <w:rPr>
-          <w:noProof/>
-        </w:rPr>
-        <w:lastRenderedPageBreak/>
-        <w:drawing>
-          <wp:inline distT="0" distB="0" distL="0" distR="0" wp14:anchorId="2362DC03" wp14:editId="0248A5F6">
-            <wp:extent cx="5943600" cy="3343275"/>
-            <wp:effectExtent l="0" t="0" r="0" b="9525"/>
-            <wp:docPr id="933808750" name="Picture 1"/>
-            <wp:cNvGraphicFramePr>
-              <a:graphicFrameLocks xmlns:a="http://schemas.openxmlformats.org/drawingml/2006/main" noChangeAspect="1"/>
-            </wp:cNvGraphicFramePr>
-            <a:graphic xmlns:a="http://schemas.openxmlformats.org/drawingml/2006/main">
-              <a:graphicData uri="http://schemas.openxmlformats.org/drawingml/2006/picture">
-                <pic:pic xmlns:pic="http://schemas.openxmlformats.org/drawingml/2006/picture">
-                  <pic:nvPicPr>
-                    <pic:cNvPr id="933808750" name=""/>
-                    <pic:cNvPicPr/>
-                  </pic:nvPicPr>
-                  <pic:blipFill>
-                    <a:blip r:embed="rId16"/>
-                    <a:stretch>
-                      <a:fillRect/>
-                    </a:stretch>
-                  </pic:blipFill>
-                  <pic:spPr>
-                    <a:xfrm>
-                      <a:off x="0" y="0"/>
-                      <a:ext cx="5943600" cy="3343275"/>
-                    </a:xfrm>
-                    <a:prstGeom prst="rect">
-                      <a:avLst/>
-                    </a:prstGeom>
-                  </pic:spPr>
-                </pic:pic>
-              </a:graphicData>
-            </a:graphic>
-          </wp:inline>
-        </w:drawing>
-      </w:r>
-      <w:r>
-        <w:rPr>
-          <w:noProof/>
-        </w:rPr>
-        <w:drawing>
-          <wp:inline distT="0" distB="0" distL="0" distR="0" wp14:anchorId="4F80A84D" wp14:editId="4C2D1B06">
-            <wp:extent cx="5943600" cy="3343275"/>
-            <wp:effectExtent l="0" t="0" r="0" b="9525"/>
-            <wp:docPr id="1383385366" name="Picture 1"/>
-            <wp:cNvGraphicFramePr>
-              <a:graphicFrameLocks xmlns:a="http://schemas.openxmlformats.org/drawingml/2006/main" noChangeAspect="1"/>
-            </wp:cNvGraphicFramePr>
-            <a:graphic xmlns:a="http://schemas.openxmlformats.org/drawingml/2006/main">
-              <a:graphicData uri="http://schemas.openxmlformats.org/drawingml/2006/picture">
-                <pic:pic xmlns:pic="http://schemas.openxmlformats.org/drawingml/2006/picture">
-                  <pic:nvPicPr>
-                    <pic:cNvPr id="1383385366" name=""/>
-                    <pic:cNvPicPr/>
-                  </pic:nvPicPr>
-                  <pic:blipFill>
-                    <a:blip r:embed="rId17"/>
-                    <a:stretch>
-                      <a:fillRect/>
-                    </a:stretch>
-                  </pic:blipFill>
-                  <pic:spPr>
-                    <a:xfrm>
-                      <a:off x="0" y="0"/>
-                      <a:ext cx="5943600" cy="3343275"/>
-                    </a:xfrm>
-                    <a:prstGeom prst="rect">
-                      <a:avLst/>
-                    </a:prstGeom>
-                  </pic:spPr>
-                </pic:pic>
-              </a:graphicData>
-            </a:graphic>
-          </wp:inline>
-        </w:drawing>
-      </w:r>
-    </w:p>
-    <w:p>
-      <w:r>
-        <w:rPr>
-          <w:noProof/>
-        </w:rPr>
-        <w:lastRenderedPageBreak/>
-        <w:drawing>
-          <wp:inline distT="0" distB="0" distL="0" distR="0" wp14:anchorId="071D99B4" wp14:editId="217EEED3">
-            <wp:extent cx="5943600" cy="3343275"/>
-            <wp:effectExtent l="0" t="0" r="0" b="9525"/>
-            <wp:docPr id="1680609003" name="Picture 1"/>
-            <wp:cNvGraphicFramePr>
-              <a:graphicFrameLocks xmlns:a="http://schemas.openxmlformats.org/drawingml/2006/main" noChangeAspect="1"/>
-            </wp:cNvGraphicFramePr>
-            <a:graphic xmlns:a="http://schemas.openxmlformats.org/drawingml/2006/main">
-              <a:graphicData uri="http://schemas.openxmlformats.org/drawingml/2006/picture">
-                <pic:pic xmlns:pic="http://schemas.openxmlformats.org/drawingml/2006/picture">
-                  <pic:nvPicPr>
-                    <pic:cNvPr id="1680609003" name=""/>
-                    <pic:cNvPicPr/>
-                  </pic:nvPicPr>
-                  <pic:blipFill>
-                    <a:blip r:embed="rId18"/>
-                    <a:stretch>
-                      <a:fillRect/>
-                    </a:stretch>
-                  </pic:blipFill>
-                  <pic:spPr>
-                    <a:xfrm>
-                      <a:off x="0" y="0"/>
-                      <a:ext cx="5943600" cy="3343275"/>
-                    </a:xfrm>
-                    <a:prstGeom prst="rect">
-                      <a:avLst/>
-                    </a:prstGeom>
-                  </pic:spPr>
-                </pic:pic>
-              </a:graphicData>
-            </a:graphic>
-          </wp:inline>
-        </w:drawing>
-      </w:r>
-    </w:p>
-    <w:p>
-      <w:r>
-        <w:rPr>
-          <w:noProof/>
-        </w:rPr>
-        <w:drawing>
-          <wp:inline distT="0" distB="0" distL="0" distR="0" wp14:anchorId="17D54B67" wp14:editId="102E3159">
-            <wp:extent cx="5943600" cy="3343275"/>
-            <wp:effectExtent l="0" t="0" r="0" b="9525"/>
-            <wp:docPr id="1710821716" name="Picture 1"/>
-            <wp:cNvGraphicFramePr>
-              <a:graphicFrameLocks xmlns:a="http://schemas.openxmlformats.org/drawingml/2006/main" noChangeAspect="1"/>
-            </wp:cNvGraphicFramePr>
-            <a:graphic xmlns:a="http://schemas.openxmlformats.org/drawingml/2006/main">
-              <a:graphicData uri="http://schemas.openxmlformats.org/drawingml/2006/picture">
-                <pic:pic xmlns:pic="http://schemas.openxmlformats.org/drawingml/2006/picture">
-                  <pic:nvPicPr>
-                    <pic:cNvPr id="1710821716" name=""/>
-                    <pic:cNvPicPr/>
-                  </pic:nvPicPr>
-                  <pic:blipFill>
-                    <a:blip r:embed="rId19"/>
-                    <a:stretch>
-                      <a:fillRect/>
-                    </a:stretch>
-                  </pic:blipFill>
-                  <pic:spPr>
-                    <a:xfrm>
-                      <a:off x="0" y="0"/>
-                      <a:ext cx="5943600" cy="3343275"/>
-                    </a:xfrm>
-                    <a:prstGeom prst="rect">
-                      <a:avLst/>
-                    </a:prstGeom>
-                  </pic:spPr>
-                </pic:pic>
-              </a:graphicData>
-            </a:graphic>
-          </wp:inline>
-        </w:drawing>
-      </w:r>
-    </w:p>
-    <w:p/>
     <w:sectPr>
       <w:pgSz w:w="12240" w:h="15840"/>
       <w:pgMar w:top="1440" w:right="1440" w:bottom="1440" w:left="1440" w:header="720" w:footer="720" w:gutter="0"/>

</xml_diff>